<commit_message>
Backtracking with Route Example  #40
</commit_message>
<xml_diff>
--- a/out/production/core-java-training/Chapter4/Chapter4.docx
+++ b/out/production/core-java-training/Chapter4/Chapter4.docx
@@ -1346,8 +1346,13 @@
         </w:rPr>
         <w:t xml:space="preserve"> </w:t>
       </w:r>
-      <w:r>
-        <w:t>sl is an</w:t>
+      <w:proofErr w:type="spellStart"/>
+      <w:r>
+        <w:t>sl</w:t>
+      </w:r>
+      <w:proofErr w:type="spellEnd"/>
+      <w:r>
+        <w:t xml:space="preserve"> is an</w:t>
       </w:r>
       <w:r>
         <w:rPr>
@@ -1648,7 +1653,23 @@
           <w:b/>
           <w:bCs/>
         </w:rPr>
-        <w:t>Methods (Behavior)</w:t>
+        <w:t>Methods (</w:t>
+      </w:r>
+      <w:proofErr w:type="spellStart"/>
+      <w:r>
+        <w:rPr>
+          <w:b/>
+          <w:bCs/>
+        </w:rPr>
+        <w:t>Behavior</w:t>
+      </w:r>
+      <w:proofErr w:type="spellEnd"/>
+      <w:r>
+        <w:rPr>
+          <w:b/>
+          <w:bCs/>
+        </w:rPr>
+        <w:t>)</w:t>
       </w:r>
     </w:p>
     <w:p>
@@ -1669,8 +1690,13 @@
           <w:numId w:val="6"/>
         </w:numPr>
       </w:pPr>
-      <w:r>
-        <w:t xml:space="preserve">bookAppointment() </w:t>
+      <w:proofErr w:type="spellStart"/>
+      <w:r>
+        <w:t>bookAppointment</w:t>
+      </w:r>
+      <w:proofErr w:type="spellEnd"/>
+      <w:r>
+        <w:t xml:space="preserve">() </w:t>
       </w:r>
     </w:p>
     <w:p>
@@ -1680,8 +1706,13 @@
           <w:numId w:val="6"/>
         </w:numPr>
       </w:pPr>
-      <w:r>
-        <w:t xml:space="preserve">cancelAppointment() </w:t>
+      <w:proofErr w:type="spellStart"/>
+      <w:r>
+        <w:t>cancelAppointment</w:t>
+      </w:r>
+      <w:proofErr w:type="spellEnd"/>
+      <w:r>
+        <w:t xml:space="preserve">() </w:t>
       </w:r>
     </w:p>
     <w:p>
@@ -1691,8 +1722,13 @@
           <w:numId w:val="6"/>
         </w:numPr>
       </w:pPr>
-      <w:r>
-        <w:t xml:space="preserve">viewDoctor() </w:t>
+      <w:proofErr w:type="spellStart"/>
+      <w:r>
+        <w:t>viewDoctor</w:t>
+      </w:r>
+      <w:proofErr w:type="spellEnd"/>
+      <w:r>
+        <w:t xml:space="preserve">() </w:t>
       </w:r>
     </w:p>
     <w:p>
@@ -1702,8 +1738,13 @@
           <w:numId w:val="6"/>
         </w:numPr>
       </w:pPr>
-      <w:r>
-        <w:t>viewPrescription()</w:t>
+      <w:proofErr w:type="spellStart"/>
+      <w:r>
+        <w:t>viewPrescription</w:t>
+      </w:r>
+      <w:proofErr w:type="spellEnd"/>
+      <w:r>
+        <w:t>()</w:t>
       </w:r>
     </w:p>
     <w:p>
@@ -1951,7 +1992,23 @@
           <w:b/>
           <w:bCs/>
         </w:rPr>
-        <w:t>Methods (Behavior)</w:t>
+        <w:t>Methods (</w:t>
+      </w:r>
+      <w:proofErr w:type="spellStart"/>
+      <w:r>
+        <w:rPr>
+          <w:b/>
+          <w:bCs/>
+        </w:rPr>
+        <w:t>Behavior</w:t>
+      </w:r>
+      <w:proofErr w:type="spellEnd"/>
+      <w:r>
+        <w:rPr>
+          <w:b/>
+          <w:bCs/>
+        </w:rPr>
+        <w:t>)</w:t>
       </w:r>
     </w:p>
     <w:p>
@@ -1961,8 +2018,13 @@
           <w:numId w:val="8"/>
         </w:numPr>
       </w:pPr>
-      <w:r>
-        <w:t xml:space="preserve">viewPatient() </w:t>
+      <w:proofErr w:type="spellStart"/>
+      <w:r>
+        <w:t>viewPatient</w:t>
+      </w:r>
+      <w:proofErr w:type="spellEnd"/>
+      <w:r>
+        <w:t xml:space="preserve">() </w:t>
       </w:r>
     </w:p>
     <w:p>
@@ -1972,8 +2034,13 @@
           <w:numId w:val="8"/>
         </w:numPr>
       </w:pPr>
-      <w:r>
-        <w:t xml:space="preserve">diagnosePatient() </w:t>
+      <w:proofErr w:type="spellStart"/>
+      <w:r>
+        <w:t>diagnosePatient</w:t>
+      </w:r>
+      <w:proofErr w:type="spellEnd"/>
+      <w:r>
+        <w:t xml:space="preserve">() </w:t>
       </w:r>
     </w:p>
     <w:p>
@@ -1983,8 +2050,13 @@
           <w:numId w:val="8"/>
         </w:numPr>
       </w:pPr>
-      <w:r>
-        <w:t xml:space="preserve">prescribeMedicine() </w:t>
+      <w:proofErr w:type="spellStart"/>
+      <w:r>
+        <w:t>prescribeMedicine</w:t>
+      </w:r>
+      <w:proofErr w:type="spellEnd"/>
+      <w:r>
+        <w:t xml:space="preserve">() </w:t>
       </w:r>
     </w:p>
     <w:p>
@@ -1994,8 +2066,13 @@
           <w:numId w:val="8"/>
         </w:numPr>
       </w:pPr>
-      <w:r>
-        <w:t>updateAvailability()</w:t>
+      <w:proofErr w:type="spellStart"/>
+      <w:r>
+        <w:t>updateAvailability</w:t>
+      </w:r>
+      <w:proofErr w:type="spellEnd"/>
+      <w:r>
+        <w:t>()</w:t>
       </w:r>
     </w:p>
     <w:p>
@@ -2214,7 +2291,23 @@
         <w:t>association relationship</w:t>
       </w:r>
       <w:r>
-        <w:t xml:space="preserve"> between the Patient and Doctor classes is represented by passing a Doctor object as a parameter to the consultDoctor() method and a Patient object as a parameter to the diagnosePatient() method. This allows the two independent objects to communicate by calling each other's methods without either object owning the other. Their interaction is established through method calls and object references, which is a common way to represent an association relationship in object-oriented programming.</w:t>
+        <w:t xml:space="preserve"> between the Patient and Doctor classes is represented by passing a Doctor object as a parameter to the </w:t>
+      </w:r>
+      <w:proofErr w:type="spellStart"/>
+      <w:r>
+        <w:t>consultDoctor</w:t>
+      </w:r>
+      <w:proofErr w:type="spellEnd"/>
+      <w:r>
+        <w:t xml:space="preserve">() method and a Patient object as a parameter to the </w:t>
+      </w:r>
+      <w:proofErr w:type="spellStart"/>
+      <w:r>
+        <w:t>diagnosePatient</w:t>
+      </w:r>
+      <w:proofErr w:type="spellEnd"/>
+      <w:r>
+        <w:t>() method. This allows the two independent objects to communicate by calling each other's methods without either object owning the other. Their interaction is established through method calls and object references, which is a common way to represent an association relationship in object-oriented programming.</w:t>
       </w:r>
     </w:p>
     <w:p>
@@ -2359,7 +2452,79 @@
     </w:p>
     <w:p>
       <w:r>
-        <w:t>When the healthcare program starts, the JVM loads the Patient, Doctor, and Main classes using the Class Loader. The JVM creates class metadata containing the class structure, including instance fields (patientId, name, age, doctorId, specialization), static fields (if defined), constructors, and methods (bookAppointment(), consultDoctor(), diagnosePatient()). During Verification, the JVM checks that the bytecode is valid and safe. In the Preparation phase, memory is allocated for static fields of the classes and they are initialized with default values (for example, an int static field becomes 0 and a reference field becomes null). During Resolution, the JVM converts symbolic references stored in the class file constant pool into direct references to the actual classes, fields, and methods. For example, the reference to Doctor inside Patient's consultDoctor(Doctor doctor) method is resolved so the JVM knows which Doctor class and diagnosePatient() method should be called. During Initialization, static fields receive their assigned values and static initialization blocks are executed. When objects are created using new Patient() and new Doctor(), their instance fields are allocated separately in the Heap and store object-specific data, while the class methods are stored once in the Method Area and shared by all objects of that class. At runtime, the Patient object communicates with the Doctor object through object references, allowing methods such as consultDoctor() and diagnosePatient() to interact.</w:t>
+        <w:t>When the healthcare program starts, the JVM loads the Patient, Doctor, and Main classes using the Class Loader. The JVM creates class metadata containing the class structure, including instance fields (</w:t>
+      </w:r>
+      <w:proofErr w:type="spellStart"/>
+      <w:r>
+        <w:t>patientId</w:t>
+      </w:r>
+      <w:proofErr w:type="spellEnd"/>
+      <w:r>
+        <w:t xml:space="preserve">, name, age, </w:t>
+      </w:r>
+      <w:proofErr w:type="spellStart"/>
+      <w:r>
+        <w:t>doctorId</w:t>
+      </w:r>
+      <w:proofErr w:type="spellEnd"/>
+      <w:r>
+        <w:t>, specialization), static fields (if defined), constructors, and methods (</w:t>
+      </w:r>
+      <w:proofErr w:type="spellStart"/>
+      <w:r>
+        <w:t>bookAppointment</w:t>
+      </w:r>
+      <w:proofErr w:type="spellEnd"/>
+      <w:r>
+        <w:t xml:space="preserve">(), </w:t>
+      </w:r>
+      <w:proofErr w:type="spellStart"/>
+      <w:r>
+        <w:t>consultDoctor</w:t>
+      </w:r>
+      <w:proofErr w:type="spellEnd"/>
+      <w:r>
+        <w:t xml:space="preserve">(), </w:t>
+      </w:r>
+      <w:proofErr w:type="spellStart"/>
+      <w:r>
+        <w:t>diagnosePatient</w:t>
+      </w:r>
+      <w:proofErr w:type="spellEnd"/>
+      <w:r>
+        <w:t xml:space="preserve">()). During Verification, the JVM checks that the bytecode is valid and safe. In the Preparation phase, memory is allocated for static fields of the classes and they are initialized with default values (for example, an int static field becomes 0 and a reference field becomes null). During Resolution, the JVM converts symbolic references stored in the class file constant pool into direct references to the actual classes, fields, and methods. For example, the reference to Doctor inside Patient's </w:t>
+      </w:r>
+      <w:proofErr w:type="spellStart"/>
+      <w:r>
+        <w:t>consultDoctor</w:t>
+      </w:r>
+      <w:proofErr w:type="spellEnd"/>
+      <w:r>
+        <w:t xml:space="preserve">(Doctor doctor) method is resolved so the JVM knows which Doctor class and </w:t>
+      </w:r>
+      <w:proofErr w:type="spellStart"/>
+      <w:r>
+        <w:t>diagnosePatient</w:t>
+      </w:r>
+      <w:proofErr w:type="spellEnd"/>
+      <w:r>
+        <w:t xml:space="preserve">() method should be called. During Initialization, static fields receive their assigned values and static initialization blocks are executed. When objects are created using new Patient() and new Doctor(), their instance fields are allocated separately in the Heap and store object-specific data, while the class methods are stored once in the Method Area and shared by all objects of that class. At runtime, the Patient object communicates with the Doctor object through object references, allowing methods such as </w:t>
+      </w:r>
+      <w:proofErr w:type="spellStart"/>
+      <w:r>
+        <w:t>consultDoctor</w:t>
+      </w:r>
+      <w:proofErr w:type="spellEnd"/>
+      <w:r>
+        <w:t xml:space="preserve">() and </w:t>
+      </w:r>
+      <w:proofErr w:type="spellStart"/>
+      <w:r>
+        <w:t>diagnosePatient</w:t>
+      </w:r>
+      <w:proofErr w:type="spellEnd"/>
+      <w:r>
+        <w:t>() to interact.</w:t>
       </w:r>
     </w:p>
     <w:p>
@@ -2527,8 +2692,13 @@
           <w:numId w:val="9"/>
         </w:numPr>
       </w:pPr>
-      <w:r>
-        <w:t xml:space="preserve">LocalDate → date handling </w:t>
+      <w:proofErr w:type="spellStart"/>
+      <w:r>
+        <w:t>LocalDate</w:t>
+      </w:r>
+      <w:proofErr w:type="spellEnd"/>
+      <w:r>
+        <w:t xml:space="preserve"> → date handling </w:t>
       </w:r>
     </w:p>
     <w:p>
@@ -2538,8 +2708,13 @@
           <w:numId w:val="9"/>
         </w:numPr>
       </w:pPr>
-      <w:r>
-        <w:t xml:space="preserve">ArrayList → dynamic collections </w:t>
+      <w:proofErr w:type="spellStart"/>
+      <w:r>
+        <w:t>ArrayList</w:t>
+      </w:r>
+      <w:proofErr w:type="spellEnd"/>
+      <w:r>
+        <w:t xml:space="preserve"> → dynamic collections </w:t>
       </w:r>
     </w:p>
     <w:p>
@@ -2618,7 +2793,753 @@
         </w:drawing>
       </w:r>
     </w:p>
+    <w:p>
+      <w:pPr>
+        <w:rPr>
+          <w:b/>
+          <w:bCs/>
+        </w:rPr>
+      </w:pPr>
+      <w:r>
+        <w:rPr>
+          <w:b/>
+          <w:bCs/>
+        </w:rPr>
+        <w:t>Creating Objects from Predefined Classes</w:t>
+      </w:r>
+    </w:p>
+    <w:p>
+      <w:r>
+        <w:t>Most Java classes represent objects that have:</w:t>
+      </w:r>
+    </w:p>
+    <w:p>
+      <w:pPr>
+        <w:numPr>
+          <w:ilvl w:val="0"/>
+          <w:numId w:val="10"/>
+        </w:numPr>
+      </w:pPr>
+      <w:r>
+        <w:rPr>
+          <w:b/>
+          <w:bCs/>
+        </w:rPr>
+        <w:t>State</w:t>
+      </w:r>
+      <w:r>
+        <w:t>:</w:t>
+      </w:r>
+      <w:r>
+        <w:t xml:space="preserve"> data stored inside the object. </w:t>
+      </w:r>
+    </w:p>
+    <w:p>
+      <w:pPr>
+        <w:numPr>
+          <w:ilvl w:val="0"/>
+          <w:numId w:val="10"/>
+        </w:numPr>
+      </w:pPr>
+      <w:r>
+        <w:rPr>
+          <w:b/>
+          <w:bCs/>
+        </w:rPr>
+        <w:t>Behaviour</w:t>
+      </w:r>
+      <w:r>
+        <w:t>:</w:t>
+      </w:r>
+      <w:r>
+        <w:t xml:space="preserve"> methods that operate on that data. </w:t>
+      </w:r>
+    </w:p>
+    <w:p>
+      <w:r>
+        <w:t>To use these classes, we usually:</w:t>
+      </w:r>
+    </w:p>
+    <w:p>
+      <w:pPr>
+        <w:numPr>
+          <w:ilvl w:val="0"/>
+          <w:numId w:val="11"/>
+        </w:numPr>
+      </w:pPr>
+      <w:r>
+        <w:t xml:space="preserve">Create an object. </w:t>
+      </w:r>
+    </w:p>
+    <w:p>
+      <w:pPr>
+        <w:numPr>
+          <w:ilvl w:val="0"/>
+          <w:numId w:val="11"/>
+        </w:numPr>
+      </w:pPr>
+      <w:r>
+        <w:t xml:space="preserve">Store its reference. </w:t>
+      </w:r>
+    </w:p>
+    <w:p>
+      <w:pPr>
+        <w:numPr>
+          <w:ilvl w:val="0"/>
+          <w:numId w:val="11"/>
+        </w:numPr>
+      </w:pPr>
+      <w:r>
+        <w:t>Call methods on that object.</w:t>
+      </w:r>
+    </w:p>
+    <w:p>
+      <w:pPr>
+        <w:spacing w:before="100" w:beforeAutospacing="1" w:after="100" w:afterAutospacing="1" w:line="240" w:lineRule="auto"/>
+        <w:ind w:left="360"/>
+        <w:rPr>
+          <w:rFonts w:ascii="Times New Roman" w:eastAsia="Times New Roman" w:hAnsi="Times New Roman" w:cs="Times New Roman"/>
+          <w:kern w:val="0"/>
+          <w:lang w:eastAsia="en-AE"/>
+          <w14:ligatures w14:val="none"/>
+        </w:rPr>
+      </w:pPr>
+      <w:r>
+        <w:rPr>
+          <w:rFonts w:ascii="Times New Roman" w:eastAsia="Times New Roman" w:hAnsi="Times New Roman" w:cs="Times New Roman"/>
+          <w:kern w:val="0"/>
+          <w:lang w:eastAsia="en-AE"/>
+          <w14:ligatures w14:val="none"/>
+        </w:rPr>
+        <w:t xml:space="preserve">For example: Date object: </w:t>
+      </w:r>
+      <w:r>
+        <w:rPr>
+          <w:rFonts w:ascii="Times New Roman" w:eastAsia="Times New Roman" w:hAnsi="Times New Roman" w:cs="Times New Roman"/>
+          <w:kern w:val="0"/>
+          <w:lang w:eastAsia="en-AE"/>
+          <w14:ligatures w14:val="none"/>
+        </w:rPr>
+        <w:t>Java provides classes for working with dates</w:t>
+      </w:r>
+    </w:p>
+    <w:p>
+      <w:pPr>
+        <w:spacing w:before="100" w:beforeAutospacing="1" w:after="100" w:afterAutospacing="1" w:line="240" w:lineRule="auto"/>
+        <w:ind w:left="360"/>
+        <w:jc w:val="center"/>
+        <w:rPr>
+          <w:rFonts w:ascii="Times New Roman" w:eastAsia="Times New Roman" w:hAnsi="Times New Roman" w:cs="Times New Roman"/>
+          <w:kern w:val="0"/>
+          <w:lang w:eastAsia="en-AE"/>
+          <w14:ligatures w14:val="none"/>
+        </w:rPr>
+      </w:pPr>
+      <w:r>
+        <w:rPr>
+          <w:noProof/>
+        </w:rPr>
+        <w:drawing>
+          <wp:inline distT="0" distB="0" distL="0" distR="0" wp14:anchorId="7760412A" wp14:editId="0FCF79B4">
+            <wp:extent cx="6150634" cy="978535"/>
+            <wp:effectExtent l="0" t="0" r="2540" b="0"/>
+            <wp:docPr id="1902994101" name="Picture 1"/>
+            <wp:cNvGraphicFramePr>
+              <a:graphicFrameLocks xmlns:a="http://schemas.openxmlformats.org/drawingml/2006/main" noChangeAspect="1"/>
+            </wp:cNvGraphicFramePr>
+            <a:graphic xmlns:a="http://schemas.openxmlformats.org/drawingml/2006/main">
+              <a:graphicData uri="http://schemas.openxmlformats.org/drawingml/2006/picture">
+                <pic:pic xmlns:pic="http://schemas.openxmlformats.org/drawingml/2006/picture">
+                  <pic:nvPicPr>
+                    <pic:cNvPr id="1902994101" name=""/>
+                    <pic:cNvPicPr/>
+                  </pic:nvPicPr>
+                  <pic:blipFill>
+                    <a:blip r:embed="rId19"/>
+                    <a:stretch>
+                      <a:fillRect/>
+                    </a:stretch>
+                  </pic:blipFill>
+                  <pic:spPr>
+                    <a:xfrm>
+                      <a:off x="0" y="0"/>
+                      <a:ext cx="6152444" cy="978823"/>
+                    </a:xfrm>
+                    <a:prstGeom prst="rect">
+                      <a:avLst/>
+                    </a:prstGeom>
+                  </pic:spPr>
+                </pic:pic>
+              </a:graphicData>
+            </a:graphic>
+          </wp:inline>
+        </w:drawing>
+      </w:r>
+    </w:p>
     <w:p/>
+    <w:p/>
+    <w:p>
+      <w:r>
+        <w:rPr>
+          <w:noProof/>
+        </w:rPr>
+        <w:lastRenderedPageBreak/>
+        <w:drawing>
+          <wp:inline distT="0" distB="0" distL="0" distR="0" wp14:anchorId="657EB690" wp14:editId="34FBE3D9">
+            <wp:extent cx="6556075" cy="523875"/>
+            <wp:effectExtent l="0" t="0" r="0" b="0"/>
+            <wp:docPr id="773657617" name="Picture 1"/>
+            <wp:cNvGraphicFramePr>
+              <a:graphicFrameLocks xmlns:a="http://schemas.openxmlformats.org/drawingml/2006/main" noChangeAspect="1"/>
+            </wp:cNvGraphicFramePr>
+            <a:graphic xmlns:a="http://schemas.openxmlformats.org/drawingml/2006/main">
+              <a:graphicData uri="http://schemas.openxmlformats.org/drawingml/2006/picture">
+                <pic:pic xmlns:pic="http://schemas.openxmlformats.org/drawingml/2006/picture">
+                  <pic:nvPicPr>
+                    <pic:cNvPr id="773657617" name=""/>
+                    <pic:cNvPicPr/>
+                  </pic:nvPicPr>
+                  <pic:blipFill>
+                    <a:blip r:embed="rId20"/>
+                    <a:stretch>
+                      <a:fillRect/>
+                    </a:stretch>
+                  </pic:blipFill>
+                  <pic:spPr>
+                    <a:xfrm>
+                      <a:off x="0" y="0"/>
+                      <a:ext cx="6558253" cy="524049"/>
+                    </a:xfrm>
+                    <a:prstGeom prst="rect">
+                      <a:avLst/>
+                    </a:prstGeom>
+                  </pic:spPr>
+                </pic:pic>
+              </a:graphicData>
+            </a:graphic>
+          </wp:inline>
+        </w:drawing>
+      </w:r>
+    </w:p>
+    <w:p>
+      <w:r>
+        <w:t xml:space="preserve">In Java, an object variable does not store the object itself; it stores a </w:t>
+      </w:r>
+      <w:r>
+        <w:rPr>
+          <w:b/>
+          <w:bCs/>
+        </w:rPr>
+        <w:t>reference</w:t>
+      </w:r>
+      <w:r>
+        <w:t xml:space="preserve"> that points to an object in memory. Declaring a variable like Date </w:t>
+      </w:r>
+      <w:proofErr w:type="spellStart"/>
+      <w:r>
+        <w:t>startTime</w:t>
+      </w:r>
+      <w:proofErr w:type="spellEnd"/>
+      <w:r>
+        <w:t xml:space="preserve">; only creates a reference variable with no object assigned, so its value is null. An object is created only when using the new keyword, such as </w:t>
+      </w:r>
+      <w:proofErr w:type="spellStart"/>
+      <w:r>
+        <w:t>startTime</w:t>
+      </w:r>
+      <w:proofErr w:type="spellEnd"/>
+      <w:r>
+        <w:t xml:space="preserve"> = new Date();, which creates the object in the heap and stores its reference inside </w:t>
+      </w:r>
+      <w:proofErr w:type="spellStart"/>
+      <w:r>
+        <w:t>startTime</w:t>
+      </w:r>
+      <w:proofErr w:type="spellEnd"/>
+      <w:r>
+        <w:t>. Therefore, methods can only be called when the variable points to a valid object.</w:t>
+      </w:r>
+    </w:p>
+    <w:p/>
+    <w:p>
+      <w:pPr>
+        <w:rPr>
+          <w:b/>
+          <w:bCs/>
+        </w:rPr>
+      </w:pPr>
+      <w:r>
+        <w:rPr>
+          <w:b/>
+          <w:bCs/>
+        </w:rPr>
+        <w:t>Multiple Variables Can Reference the Same Object</w:t>
+      </w:r>
+    </w:p>
+    <w:p>
+      <w:r>
+        <w:t xml:space="preserve">In Java, multiple object variables can point to the same object in the </w:t>
+      </w:r>
+      <w:r>
+        <w:rPr>
+          <w:b/>
+          <w:bCs/>
+        </w:rPr>
+        <w:t>heap</w:t>
+      </w:r>
+      <w:r>
+        <w:t>. Assigning one object variable to another does not create a new object; it only copies the reference. Therefore, both variables access and modify the same object.</w:t>
+      </w:r>
+    </w:p>
+    <w:p/>
+    <w:p>
+      <w:pPr>
+        <w:rPr>
+          <w:b/>
+          <w:bCs/>
+        </w:rPr>
+      </w:pPr>
+      <w:r>
+        <w:rPr>
+          <w:b/>
+          <w:bCs/>
+        </w:rPr>
+        <w:t>The null Reference</w:t>
+      </w:r>
+    </w:p>
+    <w:p>
+      <w:r>
+        <w:t>Java allows an object variable to exist without referring to any object by assigning it the value null. A null reference means that no object is currently connected to the variable.</w:t>
+      </w:r>
+    </w:p>
+    <w:p/>
+    <w:p>
+      <w:pPr>
+        <w:rPr>
+          <w:b/>
+          <w:bCs/>
+        </w:rPr>
+      </w:pPr>
+      <w:r>
+        <w:rPr>
+          <w:b/>
+          <w:bCs/>
+        </w:rPr>
+        <w:t xml:space="preserve">The </w:t>
+      </w:r>
+      <w:proofErr w:type="spellStart"/>
+      <w:r>
+        <w:rPr>
+          <w:b/>
+          <w:bCs/>
+        </w:rPr>
+        <w:t>LocalDate</w:t>
+      </w:r>
+      <w:proofErr w:type="spellEnd"/>
+      <w:r>
+        <w:rPr>
+          <w:b/>
+          <w:bCs/>
+        </w:rPr>
+        <w:t xml:space="preserve"> Class</w:t>
+      </w:r>
+    </w:p>
+    <w:p>
+      <w:proofErr w:type="spellStart"/>
+      <w:r>
+        <w:t>LocalDate</w:t>
+      </w:r>
+      <w:proofErr w:type="spellEnd"/>
+      <w:r>
+        <w:t xml:space="preserve"> is a predefined Java class used to represent calendar dates. It allows developers to create and manipulate dates without knowing how dates are stored internally. The class uses static factory methods such as now() and of() to create objects. </w:t>
+      </w:r>
+      <w:proofErr w:type="spellStart"/>
+      <w:r>
+        <w:t>LocalDate</w:t>
+      </w:r>
+      <w:proofErr w:type="spellEnd"/>
+      <w:r>
+        <w:t xml:space="preserve"> is immutable, meaning its objects cannot be changed after creation. </w:t>
+      </w:r>
+    </w:p>
+    <w:p/>
+    <w:p>
+      <w:pPr>
+        <w:rPr>
+          <w:b/>
+          <w:bCs/>
+        </w:rPr>
+      </w:pPr>
+      <w:r>
+        <w:rPr>
+          <w:b/>
+          <w:bCs/>
+        </w:rPr>
+        <w:t>Accessor Methods</w:t>
+      </w:r>
+    </w:p>
+    <w:p>
+      <w:r>
+        <w:t xml:space="preserve">Accessor methods are methods used to </w:t>
+      </w:r>
+      <w:r>
+        <w:rPr>
+          <w:b/>
+          <w:bCs/>
+        </w:rPr>
+        <w:t>read information from an object without changing its state</w:t>
+      </w:r>
+      <w:r>
+        <w:t>. They allow controlled access to private data while maintaining encapsulation.</w:t>
+      </w:r>
+    </w:p>
+    <w:p/>
+    <w:p>
+      <w:pPr>
+        <w:rPr>
+          <w:b/>
+          <w:bCs/>
+        </w:rPr>
+      </w:pPr>
+      <w:r>
+        <w:rPr>
+          <w:b/>
+          <w:bCs/>
+        </w:rPr>
+        <w:t>Mutator Methods</w:t>
+      </w:r>
+    </w:p>
+    <w:p>
+      <w:r>
+        <w:t xml:space="preserve">Mutator methods are methods that </w:t>
+      </w:r>
+      <w:r>
+        <w:rPr>
+          <w:b/>
+          <w:bCs/>
+        </w:rPr>
+        <w:t>change the internal state of an object</w:t>
+      </w:r>
+      <w:r>
+        <w:t>. When a mutator method is called, the object's stored data is modified.</w:t>
+      </w:r>
+    </w:p>
+    <w:p/>
+    <w:p>
+      <w:pPr>
+        <w:rPr>
+          <w:b/>
+          <w:bCs/>
+        </w:rPr>
+      </w:pPr>
+      <w:r>
+        <w:rPr>
+          <w:b/>
+          <w:bCs/>
+        </w:rPr>
+        <w:t>Immutable Objects</w:t>
+      </w:r>
+    </w:p>
+    <w:p>
+      <w:r>
+        <w:t>An immutable object is an object whose state cannot be changed after it is created. Instead of modifying the existing object, methods create and return a new object with the updated value.</w:t>
+      </w:r>
+    </w:p>
+    <w:p/>
+    <w:p>
+      <w:pPr>
+        <w:rPr>
+          <w:b/>
+          <w:bCs/>
+        </w:rPr>
+      </w:pPr>
+      <w:r>
+        <w:rPr>
+          <w:b/>
+          <w:bCs/>
+        </w:rPr>
+        <w:t>I</w:t>
+      </w:r>
+      <w:r>
+        <w:rPr>
+          <w:b/>
+          <w:bCs/>
+        </w:rPr>
+        <w:t>mplicit and Explicit Parameters</w:t>
+      </w:r>
+    </w:p>
+    <w:p>
+      <w:r>
+        <w:t xml:space="preserve">In Java, every instance method works with two types of parameters: an </w:t>
+      </w:r>
+      <w:r>
+        <w:rPr>
+          <w:b/>
+          <w:bCs/>
+        </w:rPr>
+        <w:t>implicit parameter</w:t>
+      </w:r>
+      <w:r>
+        <w:t xml:space="preserve"> and </w:t>
+      </w:r>
+      <w:r>
+        <w:rPr>
+          <w:b/>
+          <w:bCs/>
+        </w:rPr>
+        <w:t>explicit parameters</w:t>
+      </w:r>
+      <w:r>
+        <w:t>. The implicit parameter is the object that calls the method and is automatically provided by Java, while explicit parameters are values passed inside the method parentheses. The keyword this refers to the implicit parameter.</w:t>
+      </w:r>
+    </w:p>
+    <w:p/>
+    <w:p>
+      <w:pPr>
+        <w:rPr>
+          <w:b/>
+          <w:bCs/>
+        </w:rPr>
+      </w:pPr>
+      <w:r>
+        <w:rPr>
+          <w:b/>
+          <w:bCs/>
+        </w:rPr>
+        <w:lastRenderedPageBreak/>
+        <w:t>Class-Based Access Privileges</w:t>
+      </w:r>
+    </w:p>
+    <w:p>
+      <w:r>
+        <w:t xml:space="preserve">In Java, objects of the same class can access each other's private fields. Private access does not mean "only this object"; it means "only code inside this class." </w:t>
+      </w:r>
+    </w:p>
+    <w:p/>
+    <w:p>
+      <w:pPr>
+        <w:rPr>
+          <w:b/>
+          <w:bCs/>
+        </w:rPr>
+      </w:pPr>
+      <w:r>
+        <w:rPr>
+          <w:b/>
+          <w:bCs/>
+        </w:rPr>
+        <w:t>Private Methods</w:t>
+      </w:r>
+    </w:p>
+    <w:p>
+      <w:r>
+        <w:t>A private method is a method that can only be called inside the same class. It hides internal operations from other classes and helps maintain encapsulation.</w:t>
+      </w:r>
+    </w:p>
+    <w:p/>
+    <w:p>
+      <w:pPr>
+        <w:rPr>
+          <w:b/>
+          <w:bCs/>
+        </w:rPr>
+      </w:pPr>
+      <w:r>
+        <w:rPr>
+          <w:b/>
+          <w:bCs/>
+        </w:rPr>
+        <w:t>F</w:t>
+      </w:r>
+      <w:r>
+        <w:rPr>
+          <w:b/>
+          <w:bCs/>
+        </w:rPr>
+        <w:t>inal Instance Fields</w:t>
+      </w:r>
+    </w:p>
+    <w:p>
+      <w:r>
+        <w:t>A final instance field is a field whose value can be assigned only once. After initialization, its reference or value cannot be changed. A final instance field must be initialized during declaration, an initializer block, or inside the constructor.</w:t>
+      </w:r>
+    </w:p>
+    <w:p/>
+    <w:p>
+      <w:pPr>
+        <w:rPr>
+          <w:b/>
+          <w:bCs/>
+        </w:rPr>
+      </w:pPr>
+      <w:r>
+        <w:rPr>
+          <w:b/>
+          <w:bCs/>
+        </w:rPr>
+        <w:t>Static Fields</w:t>
+      </w:r>
+    </w:p>
+    <w:p>
+      <w:r>
+        <w:t xml:space="preserve">A </w:t>
+      </w:r>
+      <w:r>
+        <w:rPr>
+          <w:b/>
+          <w:bCs/>
+        </w:rPr>
+        <w:t>static field</w:t>
+      </w:r>
+      <w:r>
+        <w:t xml:space="preserve"> is a variable that belongs to the </w:t>
+      </w:r>
+      <w:r>
+        <w:rPr>
+          <w:b/>
+          <w:bCs/>
+        </w:rPr>
+        <w:t>class itself</w:t>
+      </w:r>
+      <w:r>
+        <w:t>, not to individual objects. Only one copy of a static field exists, and all objects created from that class share the same value. Static fields are stored once and are useful for data that should be common across all instances</w:t>
+      </w:r>
+    </w:p>
+    <w:p/>
+    <w:p>
+      <w:pPr>
+        <w:rPr>
+          <w:b/>
+          <w:bCs/>
+        </w:rPr>
+      </w:pPr>
+      <w:r>
+        <w:rPr>
+          <w:b/>
+          <w:bCs/>
+        </w:rPr>
+        <w:t>Static Constants</w:t>
+      </w:r>
+    </w:p>
+    <w:p>
+      <w:r>
+        <w:t xml:space="preserve">A </w:t>
+      </w:r>
+      <w:r>
+        <w:rPr>
+          <w:b/>
+          <w:bCs/>
+        </w:rPr>
+        <w:t>static constant</w:t>
+      </w:r>
+      <w:r>
+        <w:t xml:space="preserve"> is a field that belongs to the class and cannot be changed after initialization. It is created using both static and final. The static keyword makes it shared, while final prevents modification.</w:t>
+      </w:r>
+    </w:p>
+    <w:p/>
+    <w:p>
+      <w:pPr>
+        <w:rPr>
+          <w:b/>
+          <w:bCs/>
+        </w:rPr>
+      </w:pPr>
+      <w:r>
+        <w:rPr>
+          <w:b/>
+          <w:bCs/>
+        </w:rPr>
+        <w:t>Static Methods</w:t>
+      </w:r>
+    </w:p>
+    <w:p>
+      <w:r>
+        <w:t xml:space="preserve">A </w:t>
+      </w:r>
+      <w:r>
+        <w:rPr>
+          <w:b/>
+          <w:bCs/>
+        </w:rPr>
+        <w:t>static method</w:t>
+      </w:r>
+      <w:r>
+        <w:t xml:space="preserve"> is a method that belongs to the class instead of a specific object. It can be called directly using the class name without creating an object. Static methods cannot directly access instance fields because they do not have an object (this) associated with them. </w:t>
+      </w:r>
+    </w:p>
+    <w:p/>
+    <w:p>
+      <w:pPr>
+        <w:rPr>
+          <w:b/>
+          <w:bCs/>
+        </w:rPr>
+      </w:pPr>
+      <w:r>
+        <w:rPr>
+          <w:b/>
+          <w:bCs/>
+        </w:rPr>
+        <w:t>Factory Methods</w:t>
+      </w:r>
+    </w:p>
+    <w:p>
+      <w:r>
+        <w:t xml:space="preserve">A </w:t>
+      </w:r>
+      <w:r>
+        <w:rPr>
+          <w:b/>
+          <w:bCs/>
+        </w:rPr>
+        <w:t>factory method</w:t>
+      </w:r>
+      <w:r>
+        <w:t xml:space="preserve"> is a method that creates and returns objects instead of using the constructor directly. In Java, factory methods are often declared as static because they create objects without requiring an existing object. They provide a controlled way to create instances.</w:t>
+      </w:r>
+    </w:p>
+    <w:p>
+      <w:r>
+        <w:rPr>
+          <w:noProof/>
+        </w:rPr>
+        <w:drawing>
+          <wp:inline distT="0" distB="0" distL="0" distR="0" wp14:anchorId="3A00D273" wp14:editId="7A296112">
+            <wp:extent cx="6661150" cy="2311880"/>
+            <wp:effectExtent l="0" t="0" r="6350" b="0"/>
+            <wp:docPr id="872432819" name="Picture 1"/>
+            <wp:cNvGraphicFramePr>
+              <a:graphicFrameLocks xmlns:a="http://schemas.openxmlformats.org/drawingml/2006/main" noChangeAspect="1"/>
+            </wp:cNvGraphicFramePr>
+            <a:graphic xmlns:a="http://schemas.openxmlformats.org/drawingml/2006/main">
+              <a:graphicData uri="http://schemas.openxmlformats.org/drawingml/2006/picture">
+                <pic:pic xmlns:pic="http://schemas.openxmlformats.org/drawingml/2006/picture">
+                  <pic:nvPicPr>
+                    <pic:cNvPr id="872432819" name=""/>
+                    <pic:cNvPicPr/>
+                  </pic:nvPicPr>
+                  <pic:blipFill>
+                    <a:blip r:embed="rId21"/>
+                    <a:stretch>
+                      <a:fillRect/>
+                    </a:stretch>
+                  </pic:blipFill>
+                  <pic:spPr>
+                    <a:xfrm>
+                      <a:off x="0" y="0"/>
+                      <a:ext cx="6686090" cy="2320536"/>
+                    </a:xfrm>
+                    <a:prstGeom prst="rect">
+                      <a:avLst/>
+                    </a:prstGeom>
+                  </pic:spPr>
+                </pic:pic>
+              </a:graphicData>
+            </a:graphic>
+          </wp:inline>
+        </w:drawing>
+      </w:r>
+    </w:p>
     <w:p/>
     <w:sectPr>
       <w:pgSz w:w="11906" w:h="16838"/>
@@ -3229,6 +4150,119 @@
     </w:lvl>
   </w:abstractNum>
   <w:abstractNum w:abstractNumId="4" w15:restartNumberingAfterBreak="0">
+    <w:nsid w:val="38BE17C3"/>
+    <w:multiLevelType w:val="multilevel"/>
+    <w:tmpl w:val="9312B01A"/>
+    <w:lvl w:ilvl="0">
+      <w:start w:val="1"/>
+      <w:numFmt w:val="decimal"/>
+      <w:lvlText w:val="%1."/>
+      <w:lvlJc w:val="left"/>
+      <w:pPr>
+        <w:tabs>
+          <w:tab w:val="num" w:pos="720"/>
+        </w:tabs>
+        <w:ind w:left="720" w:hanging="360"/>
+      </w:pPr>
+    </w:lvl>
+    <w:lvl w:ilvl="1" w:tentative="1">
+      <w:start w:val="1"/>
+      <w:numFmt w:val="decimal"/>
+      <w:lvlText w:val="%2."/>
+      <w:lvlJc w:val="left"/>
+      <w:pPr>
+        <w:tabs>
+          <w:tab w:val="num" w:pos="1440"/>
+        </w:tabs>
+        <w:ind w:left="1440" w:hanging="360"/>
+      </w:pPr>
+    </w:lvl>
+    <w:lvl w:ilvl="2" w:tentative="1">
+      <w:start w:val="1"/>
+      <w:numFmt w:val="decimal"/>
+      <w:lvlText w:val="%3."/>
+      <w:lvlJc w:val="left"/>
+      <w:pPr>
+        <w:tabs>
+          <w:tab w:val="num" w:pos="2160"/>
+        </w:tabs>
+        <w:ind w:left="2160" w:hanging="360"/>
+      </w:pPr>
+    </w:lvl>
+    <w:lvl w:ilvl="3" w:tentative="1">
+      <w:start w:val="1"/>
+      <w:numFmt w:val="decimal"/>
+      <w:lvlText w:val="%4."/>
+      <w:lvlJc w:val="left"/>
+      <w:pPr>
+        <w:tabs>
+          <w:tab w:val="num" w:pos="2880"/>
+        </w:tabs>
+        <w:ind w:left="2880" w:hanging="360"/>
+      </w:pPr>
+    </w:lvl>
+    <w:lvl w:ilvl="4" w:tentative="1">
+      <w:start w:val="1"/>
+      <w:numFmt w:val="decimal"/>
+      <w:lvlText w:val="%5."/>
+      <w:lvlJc w:val="left"/>
+      <w:pPr>
+        <w:tabs>
+          <w:tab w:val="num" w:pos="3600"/>
+        </w:tabs>
+        <w:ind w:left="3600" w:hanging="360"/>
+      </w:pPr>
+    </w:lvl>
+    <w:lvl w:ilvl="5" w:tentative="1">
+      <w:start w:val="1"/>
+      <w:numFmt w:val="decimal"/>
+      <w:lvlText w:val="%6."/>
+      <w:lvlJc w:val="left"/>
+      <w:pPr>
+        <w:tabs>
+          <w:tab w:val="num" w:pos="4320"/>
+        </w:tabs>
+        <w:ind w:left="4320" w:hanging="360"/>
+      </w:pPr>
+    </w:lvl>
+    <w:lvl w:ilvl="6" w:tentative="1">
+      <w:start w:val="1"/>
+      <w:numFmt w:val="decimal"/>
+      <w:lvlText w:val="%7."/>
+      <w:lvlJc w:val="left"/>
+      <w:pPr>
+        <w:tabs>
+          <w:tab w:val="num" w:pos="5040"/>
+        </w:tabs>
+        <w:ind w:left="5040" w:hanging="360"/>
+      </w:pPr>
+    </w:lvl>
+    <w:lvl w:ilvl="7" w:tentative="1">
+      <w:start w:val="1"/>
+      <w:numFmt w:val="decimal"/>
+      <w:lvlText w:val="%8."/>
+      <w:lvlJc w:val="left"/>
+      <w:pPr>
+        <w:tabs>
+          <w:tab w:val="num" w:pos="5760"/>
+        </w:tabs>
+        <w:ind w:left="5760" w:hanging="360"/>
+      </w:pPr>
+    </w:lvl>
+    <w:lvl w:ilvl="8" w:tentative="1">
+      <w:start w:val="1"/>
+      <w:numFmt w:val="decimal"/>
+      <w:lvlText w:val="%9."/>
+      <w:lvlJc w:val="left"/>
+      <w:pPr>
+        <w:tabs>
+          <w:tab w:val="num" w:pos="6480"/>
+        </w:tabs>
+        <w:ind w:left="6480" w:hanging="360"/>
+      </w:pPr>
+    </w:lvl>
+  </w:abstractNum>
+  <w:abstractNum w:abstractNumId="5" w15:restartNumberingAfterBreak="0">
     <w:nsid w:val="3F137A4D"/>
     <w:multiLevelType w:val="multilevel"/>
     <w:tmpl w:val="7326D258"/>
@@ -3377,7 +4411,7 @@
       </w:rPr>
     </w:lvl>
   </w:abstractNum>
-  <w:abstractNum w:abstractNumId="5" w15:restartNumberingAfterBreak="0">
+  <w:abstractNum w:abstractNumId="6" w15:restartNumberingAfterBreak="0">
     <w:nsid w:val="5804509C"/>
     <w:multiLevelType w:val="multilevel"/>
     <w:tmpl w:val="7C5A0912"/>
@@ -3526,7 +4560,7 @@
       </w:rPr>
     </w:lvl>
   </w:abstractNum>
-  <w:abstractNum w:abstractNumId="6" w15:restartNumberingAfterBreak="0">
+  <w:abstractNum w:abstractNumId="7" w15:restartNumberingAfterBreak="0">
     <w:nsid w:val="5AAB25B5"/>
     <w:multiLevelType w:val="multilevel"/>
     <w:tmpl w:val="7236F5CA"/>
@@ -3675,7 +4709,7 @@
       </w:rPr>
     </w:lvl>
   </w:abstractNum>
-  <w:abstractNum w:abstractNumId="7" w15:restartNumberingAfterBreak="0">
+  <w:abstractNum w:abstractNumId="8" w15:restartNumberingAfterBreak="0">
     <w:nsid w:val="5F3C5130"/>
     <w:multiLevelType w:val="multilevel"/>
     <w:tmpl w:val="DC9AA11C"/>
@@ -3824,7 +4858,156 @@
       </w:rPr>
     </w:lvl>
   </w:abstractNum>
-  <w:abstractNum w:abstractNumId="8" w15:restartNumberingAfterBreak="0">
+  <w:abstractNum w:abstractNumId="9" w15:restartNumberingAfterBreak="0">
+    <w:nsid w:val="6DB757D9"/>
+    <w:multiLevelType w:val="multilevel"/>
+    <w:tmpl w:val="EB68BC68"/>
+    <w:lvl w:ilvl="0">
+      <w:start w:val="1"/>
+      <w:numFmt w:val="bullet"/>
+      <w:lvlText w:val=""/>
+      <w:lvlJc w:val="left"/>
+      <w:pPr>
+        <w:tabs>
+          <w:tab w:val="num" w:pos="720"/>
+        </w:tabs>
+        <w:ind w:left="720" w:hanging="360"/>
+      </w:pPr>
+      <w:rPr>
+        <w:rFonts w:ascii="Symbol" w:hAnsi="Symbol" w:hint="default"/>
+        <w:sz w:val="20"/>
+      </w:rPr>
+    </w:lvl>
+    <w:lvl w:ilvl="1" w:tentative="1">
+      <w:start w:val="1"/>
+      <w:numFmt w:val="bullet"/>
+      <w:lvlText w:val="o"/>
+      <w:lvlJc w:val="left"/>
+      <w:pPr>
+        <w:tabs>
+          <w:tab w:val="num" w:pos="1440"/>
+        </w:tabs>
+        <w:ind w:left="1440" w:hanging="360"/>
+      </w:pPr>
+      <w:rPr>
+        <w:rFonts w:ascii="Courier New" w:hAnsi="Courier New" w:hint="default"/>
+        <w:sz w:val="20"/>
+      </w:rPr>
+    </w:lvl>
+    <w:lvl w:ilvl="2" w:tentative="1">
+      <w:start w:val="1"/>
+      <w:numFmt w:val="bullet"/>
+      <w:lvlText w:val=""/>
+      <w:lvlJc w:val="left"/>
+      <w:pPr>
+        <w:tabs>
+          <w:tab w:val="num" w:pos="2160"/>
+        </w:tabs>
+        <w:ind w:left="2160" w:hanging="360"/>
+      </w:pPr>
+      <w:rPr>
+        <w:rFonts w:ascii="Wingdings" w:hAnsi="Wingdings" w:hint="default"/>
+        <w:sz w:val="20"/>
+      </w:rPr>
+    </w:lvl>
+    <w:lvl w:ilvl="3" w:tentative="1">
+      <w:start w:val="1"/>
+      <w:numFmt w:val="bullet"/>
+      <w:lvlText w:val=""/>
+      <w:lvlJc w:val="left"/>
+      <w:pPr>
+        <w:tabs>
+          <w:tab w:val="num" w:pos="2880"/>
+        </w:tabs>
+        <w:ind w:left="2880" w:hanging="360"/>
+      </w:pPr>
+      <w:rPr>
+        <w:rFonts w:ascii="Wingdings" w:hAnsi="Wingdings" w:hint="default"/>
+        <w:sz w:val="20"/>
+      </w:rPr>
+    </w:lvl>
+    <w:lvl w:ilvl="4" w:tentative="1">
+      <w:start w:val="1"/>
+      <w:numFmt w:val="bullet"/>
+      <w:lvlText w:val=""/>
+      <w:lvlJc w:val="left"/>
+      <w:pPr>
+        <w:tabs>
+          <w:tab w:val="num" w:pos="3600"/>
+        </w:tabs>
+        <w:ind w:left="3600" w:hanging="360"/>
+      </w:pPr>
+      <w:rPr>
+        <w:rFonts w:ascii="Wingdings" w:hAnsi="Wingdings" w:hint="default"/>
+        <w:sz w:val="20"/>
+      </w:rPr>
+    </w:lvl>
+    <w:lvl w:ilvl="5" w:tentative="1">
+      <w:start w:val="1"/>
+      <w:numFmt w:val="bullet"/>
+      <w:lvlText w:val=""/>
+      <w:lvlJc w:val="left"/>
+      <w:pPr>
+        <w:tabs>
+          <w:tab w:val="num" w:pos="4320"/>
+        </w:tabs>
+        <w:ind w:left="4320" w:hanging="360"/>
+      </w:pPr>
+      <w:rPr>
+        <w:rFonts w:ascii="Wingdings" w:hAnsi="Wingdings" w:hint="default"/>
+        <w:sz w:val="20"/>
+      </w:rPr>
+    </w:lvl>
+    <w:lvl w:ilvl="6" w:tentative="1">
+      <w:start w:val="1"/>
+      <w:numFmt w:val="bullet"/>
+      <w:lvlText w:val=""/>
+      <w:lvlJc w:val="left"/>
+      <w:pPr>
+        <w:tabs>
+          <w:tab w:val="num" w:pos="5040"/>
+        </w:tabs>
+        <w:ind w:left="5040" w:hanging="360"/>
+      </w:pPr>
+      <w:rPr>
+        <w:rFonts w:ascii="Wingdings" w:hAnsi="Wingdings" w:hint="default"/>
+        <w:sz w:val="20"/>
+      </w:rPr>
+    </w:lvl>
+    <w:lvl w:ilvl="7" w:tentative="1">
+      <w:start w:val="1"/>
+      <w:numFmt w:val="bullet"/>
+      <w:lvlText w:val=""/>
+      <w:lvlJc w:val="left"/>
+      <w:pPr>
+        <w:tabs>
+          <w:tab w:val="num" w:pos="5760"/>
+        </w:tabs>
+        <w:ind w:left="5760" w:hanging="360"/>
+      </w:pPr>
+      <w:rPr>
+        <w:rFonts w:ascii="Wingdings" w:hAnsi="Wingdings" w:hint="default"/>
+        <w:sz w:val="20"/>
+      </w:rPr>
+    </w:lvl>
+    <w:lvl w:ilvl="8" w:tentative="1">
+      <w:start w:val="1"/>
+      <w:numFmt w:val="bullet"/>
+      <w:lvlText w:val=""/>
+      <w:lvlJc w:val="left"/>
+      <w:pPr>
+        <w:tabs>
+          <w:tab w:val="num" w:pos="6480"/>
+        </w:tabs>
+        <w:ind w:left="6480" w:hanging="360"/>
+      </w:pPr>
+      <w:rPr>
+        <w:rFonts w:ascii="Wingdings" w:hAnsi="Wingdings" w:hint="default"/>
+        <w:sz w:val="20"/>
+      </w:rPr>
+    </w:lvl>
+  </w:abstractNum>
+  <w:abstractNum w:abstractNumId="10" w15:restartNumberingAfterBreak="0">
     <w:nsid w:val="72B12E7D"/>
     <w:multiLevelType w:val="multilevel"/>
     <w:tmpl w:val="55BEC34C"/>
@@ -3974,7 +5157,7 @@
     </w:lvl>
   </w:abstractNum>
   <w:num w:numId="1" w16cid:durableId="1978945811">
-    <w:abstractNumId w:val="6"/>
+    <w:abstractNumId w:val="7"/>
   </w:num>
   <w:num w:numId="2" w16cid:durableId="1238049275">
     <w:abstractNumId w:val="0"/>
@@ -3983,22 +5166,28 @@
     <w:abstractNumId w:val="2"/>
   </w:num>
   <w:num w:numId="4" w16cid:durableId="776372018">
-    <w:abstractNumId w:val="5"/>
+    <w:abstractNumId w:val="6"/>
   </w:num>
   <w:num w:numId="5" w16cid:durableId="739668218">
-    <w:abstractNumId w:val="7"/>
+    <w:abstractNumId w:val="8"/>
   </w:num>
   <w:num w:numId="6" w16cid:durableId="1484850568">
-    <w:abstractNumId w:val="8"/>
+    <w:abstractNumId w:val="10"/>
   </w:num>
   <w:num w:numId="7" w16cid:durableId="316498941">
-    <w:abstractNumId w:val="4"/>
+    <w:abstractNumId w:val="5"/>
   </w:num>
   <w:num w:numId="8" w16cid:durableId="699165677">
     <w:abstractNumId w:val="3"/>
   </w:num>
   <w:num w:numId="9" w16cid:durableId="2016688739">
     <w:abstractNumId w:val="1"/>
+  </w:num>
+  <w:num w:numId="10" w16cid:durableId="1198927766">
+    <w:abstractNumId w:val="9"/>
+  </w:num>
+  <w:num w:numId="11" w16cid:durableId="694581721">
+    <w:abstractNumId w:val="4"/>
   </w:num>
 </w:numbering>
 </file>
@@ -4432,7 +5621,6 @@
     <w:next w:val="Normal"/>
     <w:link w:val="Heading2Char"/>
     <w:uiPriority w:val="9"/>
-    <w:semiHidden/>
     <w:unhideWhenUsed/>
     <w:qFormat/>
     <w:rsid w:val="005665FC"/>
@@ -4648,7 +5836,6 @@
     <w:basedOn w:val="DefaultParagraphFont"/>
     <w:link w:val="Heading2"/>
     <w:uiPriority w:val="9"/>
-    <w:semiHidden/>
     <w:rsid w:val="005665FC"/>
     <w:rPr>
       <w:rFonts w:asciiTheme="majorHAnsi" w:eastAsiaTheme="majorEastAsia" w:hAnsiTheme="majorHAnsi" w:cstheme="majorBidi"/>
@@ -4941,6 +6128,25 @@
     <w:rPr>
       <w:color w:val="605E5C"/>
       <w:shd w:val="clear" w:color="auto" w:fill="E1DFDD"/>
+    </w:rPr>
+  </w:style>
+  <w:style w:type="paragraph" w:styleId="NormalWeb">
+    <w:name w:val="Normal (Web)"/>
+    <w:basedOn w:val="Normal"/>
+    <w:uiPriority w:val="99"/>
+    <w:semiHidden/>
+    <w:unhideWhenUsed/>
+    <w:rsid w:val="00687D48"/>
+    <w:pPr>
+      <w:spacing w:before="100" w:beforeAutospacing="1" w:after="100" w:afterAutospacing="1" w:line="240" w:lineRule="auto"/>
+    </w:pPr>
+    <w:rPr>
+      <w:rFonts w:ascii="Times New Roman" w:eastAsia="Times New Roman" w:hAnsi="Times New Roman" w:cs="Times New Roman"/>
+      <w:kern w:val="0"/>
+      <w:sz w:val="24"/>
+      <w:szCs w:val="24"/>
+      <w:lang w:eastAsia="en-AE"/>
+      <w14:ligatures w14:val="none"/>
     </w:rPr>
   </w:style>
 </w:styles>

</xml_diff>